<commit_message>
fix: remove subtitulo azul TUTOR INT 5224 do sidebar do painel admin
</commit_message>
<xml_diff>
--- a/documentos/Relatorio_Executivo_Mudancas_e_Painel_Admin_18Ago2026.docx
+++ b/documentos/Relatorio_Executivo_Mudancas_e_Painel_Admin_18Ago2026.docx
@@ -3,23 +3,148 @@
 <w:document xmlns:wpc="http://schemas.microsoft.com/office/word/2010/wordprocessingCanvas" xmlns:mo="http://schemas.microsoft.com/office/mac/office/2008/main" xmlns:mc="http://schemas.openxmlformats.org/markup-compatibility/2006" xmlns:mv="urn:schemas-microsoft-com:mac:vml" xmlns:o="urn:schemas-microsoft-com:office:office" xmlns:r="http://schemas.openxmlformats.org/officeDocument/2006/relationships" xmlns:m="http://schemas.openxmlformats.org/officeDocument/2006/math" xmlns:v="urn:schemas-microsoft-com:vml" xmlns:wp14="http://schemas.microsoft.com/office/word/2010/wordprocessingDrawing" xmlns:wp="http://schemas.openxmlformats.org/drawingml/2006/wordprocessingDrawing" xmlns:w10="urn:schemas-microsoft-com:office:word" xmlns:w="http://schemas.openxmlformats.org/wordprocessingml/2006/main" xmlns:w14="http://schemas.microsoft.com/office/word/2010/wordml" xmlns:wpg="http://schemas.microsoft.com/office/word/2010/wordprocessingGroup" xmlns:wpi="http://schemas.microsoft.com/office/word/2010/wordprocessingInk" xmlns:wne="http://schemas.microsoft.com/office/word/2006/wordml" xmlns:wps="http://schemas.microsoft.com/office/word/2010/wordprocessingShape" mc:Ignorable="w14 wp14">
   <w:body>
     <w:p>
+      <w:pPr>
+        <w:spacing w:before="0" w:after="80"/>
+      </w:pPr>
       <w:r>
         <w:rPr>
+          <w:rFonts w:ascii="Calibri" w:hAnsi="Calibri"/>
           <w:b/>
-          <w:color w:val="1573C2"/>
-          <w:sz w:val="32"/>
+          <w:color w:val="0B3A66"/>
+          <w:sz w:val="40"/>
         </w:rPr>
-        <w:t>RELATÓRIO EXECUTIVO DE ATUALIZAÇÕES E GUIA DO PAINEL ADMINISTRATIVO</w:t>
+        <w:t>Relatório Executivo de Atualizações e Guia do Painel</w:t>
       </w:r>
     </w:p>
     <w:p>
+      <w:pPr>
+        <w:spacing w:after="280"/>
+      </w:pPr>
       <w:r>
         <w:rPr>
-          <w:i/>
-          <w:color w:val="505050"/>
-          <w:sz w:val="22"/>
+          <w:rFonts w:ascii="Calibri" w:hAnsi="Calibri"/>
+          <w:color w:val="5A6978"/>
+          <w:sz w:val="24"/>
         </w:rPr>
-        <w:t>Assistente de Inteligência Artificial para INT 5224 – O cuidado no processo de viver humano II: a condição cirúrgica (UFSC)</w:t>
+        <w:t>Tutor de Inteligência Artificial — Disciplina INT 5224 (UFSC)</w:t>
+      </w:r>
+    </w:p>
+    <w:tbl>
+      <w:tblPr>
+        <w:tblW w:type="auto" w:w="0"/>
+        <w:jc w:val="center"/>
+        <w:tblLayout w:type="fixed"/>
+        <w:tblLook w:firstColumn="1" w:firstRow="1" w:lastColumn="0" w:lastRow="0" w:noHBand="0" w:noVBand="1" w:val="04A0"/>
+      </w:tblPr>
+      <w:tblGrid>
+        <w:gridCol w:w="4658"/>
+        <w:gridCol w:w="4658"/>
+      </w:tblGrid>
+      <w:tr>
+        <w:tc>
+          <w:tcPr>
+            <w:tcW w:type="dxa" w:w="4608"/>
+            <w:shd w:fill="F1F5F9"/>
+            <w:tcMar>
+              <w:top w:w="120" w:type="dxa"/>
+              <w:bottom w:w="120" w:type="dxa"/>
+              <w:left w:w="180" w:type="dxa"/>
+              <w:right w:w="180" w:type="dxa"/>
+            </w:tcMar>
+          </w:tcPr>
+          <w:p>
+            <w:r>
+              <w:rPr>
+                <w:sz w:val="19"/>
+              </w:rPr>
+              <w:t>Data do Relatório: 18 de agosto de 2026</w:t>
+              <w:br/>
+              <w:t>Versão do Sistema: v2.4 (Produção)</w:t>
+            </w:r>
+          </w:p>
+        </w:tc>
+        <w:tc>
+          <w:tcPr>
+            <w:tcW w:type="dxa" w:w="4608"/>
+            <w:shd w:fill="F1F5F9"/>
+            <w:tcMar>
+              <w:top w:w="120" w:type="dxa"/>
+              <w:bottom w:w="120" w:type="dxa"/>
+              <w:left w:w="180" w:type="dxa"/>
+              <w:right w:w="180" w:type="dxa"/>
+            </w:tcMar>
+          </w:tcPr>
+          <w:p>
+            <w:r>
+              <w:rPr>
+                <w:sz w:val="19"/>
+              </w:rPr>
+              <w:t>Status: 100% Operacional em Nuvem</w:t>
+              <w:br/>
+              <w:t>Base RAG: 122 Documentos (36.004 chunks)</w:t>
+            </w:r>
+          </w:p>
+        </w:tc>
+      </w:tr>
+      <w:tr>
+        <w:tc>
+          <w:tcPr>
+            <w:tcW w:type="dxa" w:w="4608"/>
+            <w:shd w:fill="E2E8F0"/>
+            <w:tcMar>
+              <w:top w:w="120" w:type="dxa"/>
+              <w:bottom w:w="120" w:type="dxa"/>
+              <w:left w:w="180" w:type="dxa"/>
+              <w:right w:w="180" w:type="dxa"/>
+            </w:tcMar>
+          </w:tcPr>
+          <w:p>
+            <w:r>
+              <w:rPr>
+                <w:sz w:val="19"/>
+              </w:rPr>
+              <w:t>Assistente do Estudante:</w:t>
+              <w:br/>
+              <w:t>https://tutor-de-enfermagem.vercel.app</w:t>
+            </w:r>
+          </w:p>
+        </w:tc>
+        <w:tc>
+          <w:tcPr>
+            <w:tcW w:type="dxa" w:w="4608"/>
+            <w:shd w:fill="E2E8F0"/>
+            <w:tcMar>
+              <w:top w:w="120" w:type="dxa"/>
+              <w:bottom w:w="120" w:type="dxa"/>
+              <w:left w:w="180" w:type="dxa"/>
+              <w:right w:w="180" w:type="dxa"/>
+            </w:tcMar>
+          </w:tcPr>
+          <w:p>
+            <w:r>
+              <w:rPr>
+                <w:sz w:val="19"/>
+              </w:rPr>
+              <w:t>Painel Administrativo:</w:t>
+              <w:br/>
+              <w:t>https://tutor-de-enfermagem.vercel.app/admin</w:t>
+            </w:r>
+          </w:p>
+        </w:tc>
+      </w:tr>
+    </w:tbl>
+    <w:p>
+      <w:pPr>
+        <w:spacing w:after="160"/>
+      </w:pPr>
+    </w:p>
+    <w:p>
+      <w:pPr>
+        <w:pStyle w:val="Heading1"/>
+        <w:spacing w:before="280" w:after="120"/>
+      </w:pPr>
+      <w:r>
+        <w:t>1. Novas Mudanças e Melhorias Implementadas</w:t>
       </w:r>
     </w:p>
     <w:p>
@@ -27,24 +152,61 @@
         <w:rPr>
           <w:b/>
         </w:rPr>
-        <w:t>Data: 18 de Agosto de 2026  |  Versão: v2.4 (Produção)</w:t>
+        <w:t>a) Estabilidade e Resiliência da IA (Multi-Model Fallback):</w:t>
         <w:br/>
       </w:r>
       <w:r>
-        <w:t>• Assistente do Estudante: https://tutor-de-enfermagem.vercel.app</w:t>
+        <w:t>Para evitar interrupções causadas por instabilidades temporárias de tráfego na API da Google (como erros de alta demanda 503), criamos uma esteira automática de contingência com 4 modelos (Gemini 3.7 Flash -&gt; Gemini 3.6 Flash -&gt; Gemini 3.5 Flash -&gt; Gemini Flash Latest). Caso ocorra lentidão externa, o sistema chaveia em milissegundos sem que o usuário perceba nenhuma falha.</w:t>
+      </w:r>
+    </w:p>
+    <w:p>
+      <w:r>
+        <w:rPr>
+          <w:b/>
+        </w:rPr>
+        <w:t>b) Refinamento da Avaliação por Estrelas (Escala Likert 1 a 5):</w:t>
         <w:br/>
       </w:r>
       <w:r>
-        <w:t>• Painel Administrativo: https://tutor-de-enfermagem.vercel.app/admin</w:t>
+        <w:t>O quadro de avaliação por estrelas agora aparece de forma contextual apenas nas etapas de conclusão do estudo (ao final de um Resumo de Conteúdo, ao final de uma questão do Simulado ou na consulta às Informações da Disciplina), mantendo o diálogo limpo nas conversas intermediárias.</w:t>
+      </w:r>
+    </w:p>
+    <w:p>
+      <w:r>
+        <w:rPr>
+          <w:b/>
+        </w:rPr>
+        <w:t>c) Registro de Notas Vinculadas por Conversa no Painel:</w:t>
         <w:br/>
+      </w:r>
+      <w:r>
+        <w:t>O identificador de cada sessão agora é associado diretamente à nota fornecida pelo aluno. Isso permite visualizar a média individual de satisfação de cada estudante na tabela de conversas e no cabeçalho do dossiê.</w:t>
+      </w:r>
+    </w:p>
+    <w:p>
+      <w:r>
+        <w:rPr>
+          <w:b/>
+        </w:rPr>
+        <w:t>d) Auditoria Completa da Base RAG e Pasta Biblioteca:</w:t>
+        <w:br/>
+      </w:r>
+      <w:r>
+        <w:t>Realizamos a verificação detalhada de todos os 122 materiais indexados na base vetorial (36.004 fragmentos de texto). A pasta Biblioteca (com livros integrais como Brunner &amp; Suddarth, Morton &amp; Fontaine, SOCERJ, NANDA-I e Medcel) compõe 85,2% de todo o conhecimento da ferramenta (30.685 fragmentos) e participa de 100% das consultas realizadas pelos estudantes.</w:t>
       </w:r>
     </w:p>
     <w:p>
       <w:pPr>
         <w:pStyle w:val="Heading1"/>
+        <w:spacing w:before="280" w:after="120"/>
       </w:pPr>
       <w:r>
-        <w:t>1. Novas Mudanças e Melhorias Implementadas Hoje</w:t>
+        <w:t>2. Guia de Funcionalidades do Painel Administrativo (/admin)</w:t>
+      </w:r>
+    </w:p>
+    <w:p>
+      <w:r>
+        <w:t>O painel administrativo foi estruturado em três abas temáticas para facilitar o acompanhamento pedagógico e técnico da disciplina:</w:t>
       </w:r>
     </w:p>
     <w:p>
@@ -52,12 +214,58 @@
         <w:pStyle w:val="Heading2"/>
       </w:pPr>
       <w:r>
-        <w:t>1.1. Sistema de Multi-Model Fallback com Alta Resiliência (Zero Interrupções)</w:t>
+        <w:t>Aba 1: Dashboard Geral (Indicadores de Uso e Desempenho)</w:t>
       </w:r>
     </w:p>
     <w:p>
       <w:r>
-        <w:t>Para eliminar qualquer mensagem de interrupção ou lentidão temporária decorrente de picos de tráfego na API do Google Gemini (como o erro 503 Service Unavailable), implementamos uma esteira automática de contingência: gemini-3.7-flash (Principal) -&gt; gemini-3.6-flash (1º Fallback) -&gt; gemini-3.5-flash (2º Fallback) -&gt; gemini-flash-latest (3º Fallback). Se houver qualquer instabilidade momentânea externa, a transição ocorre de forma transparente e o estudante nunca fica sem resposta.</w:t>
+        <w:rPr>
+          <w:b/>
+        </w:rPr>
+        <w:t xml:space="preserve">• Indicadores Principais (Cards de KPI): </w:t>
+      </w:r>
+      <w:r>
+        <w:t>Apresenta o total de conversas, total de mensagens, tempo médio de resposta da IA, percentual de precisão do RAG e nota média de satisfação dos alunos.</w:t>
+        <w:br/>
+      </w:r>
+      <w:r>
+        <w:rPr>
+          <w:b/>
+        </w:rPr>
+        <w:t xml:space="preserve">• Gráfico de Acessos por Dia: </w:t>
+      </w:r>
+      <w:r>
+        <w:t>Exibe a curva diária de mensagens trocadas, permitindo identificar picos de estudo antes de provas e entregas.</w:t>
+        <w:br/>
+      </w:r>
+      <w:r>
+        <w:rPr>
+          <w:b/>
+        </w:rPr>
+        <w:t xml:space="preserve">• Modos de Estudo: </w:t>
+      </w:r>
+      <w:r>
+        <w:t>Gráfico de setores que divide o uso entre Resumos, Quizes, Informações da Disciplina e Perguntas Livres.</w:t>
+        <w:br/>
+      </w:r>
+      <w:r>
+        <w:rPr>
+          <w:b/>
+        </w:rPr>
+        <w:t xml:space="preserve">• Temas Mais Consultados: </w:t>
+      </w:r>
+      <w:r>
+        <w:t>Ranking clínico dos assuntos mais estudados (Hemostasia, Feridas, Cirurgia Bariátrica, Anestesia, Estomas, etc.), funcionando como termômetro das principais dúvidas da turma.</w:t>
+        <w:br/>
+      </w:r>
+      <w:r>
+        <w:rPr>
+          <w:b/>
+        </w:rPr>
+        <w:t xml:space="preserve">• Quadro de Avaliação de Satisfação: </w:t>
+      </w:r>
+      <w:r>
+        <w:t>Exibe o histograma completo de notas de 1 a 5 estrelas e o percentual de aprovação geral.</w:t>
       </w:r>
     </w:p>
     <w:p>
@@ -65,20 +273,38 @@
         <w:pStyle w:val="Heading2"/>
       </w:pPr>
       <w:r>
-        <w:t>1.2. Refinamento das Avaliações por Estrelas (Likert 1 a 5 ⭐)</w:t>
+        <w:t>Aba 2: Registro de Conversas e Dossiês Pedagógicos</w:t>
       </w:r>
     </w:p>
     <w:p>
       <w:r>
-        <w:t>O widget interativo de avaliação por 5 estrelas agora é exibido estritamente nos momentos conclusivos e pertinentes do estudo:</w:t>
+        <w:rPr>
+          <w:b/>
+        </w:rPr>
+        <w:t xml:space="preserve">• Busca e Filtros Rápidos: </w:t>
+      </w:r>
+      <w:r>
+        <w:t>Permite localizar sessões por palavra-chave, tema clínico ou filtrar apenas conversas de quiz ou resumo.</w:t>
         <w:br/>
-        <w:t>• Ao final dos Resumos de Conteúdo e Aprofundamentos de temas.</w:t>
+      </w:r>
+      <w:r>
+        <w:rPr>
+          <w:b/>
+        </w:rPr>
+        <w:t xml:space="preserve">• Tabela Dinâmica: </w:t>
+      </w:r>
+      <w:r>
+        <w:t>Lista todas as sessões com identificador, primeira mensagem, tema detectado, data/hora, quantidade de interações e a nota atribuída pelo aluno.</w:t>
         <w:br/>
-        <w:t>• Ao final da resolução de questões do Simulado / Quiz da Disciplina.</w:t>
-        <w:br/>
-        <w:t>• Ao final das Informações da Disciplina INT 5224.</w:t>
-        <w:br/>
-        <w:t>Foi removido de saudações iniciais, perguntas intermediárias e mensagens de menu.</w:t>
+      </w:r>
+      <w:r>
+        <w:rPr>
+          <w:b/>
+        </w:rPr>
+        <w:t xml:space="preserve">• Visualização de Dossiê: </w:t>
+      </w:r>
+      <w:r>
+        <w:t>Ao clicar em "Ver Dossiê", a coordenação pode ler toda a transcrição da conversa entre o estudante e o tutor, com a opção de baixar o histórico completo em arquivo de texto (.TXT).</w:t>
       </w:r>
     </w:p>
     <w:p>
@@ -86,135 +312,80 @@
         <w:pStyle w:val="Heading2"/>
       </w:pPr>
       <w:r>
-        <w:t>1.3. Integração Completa das Notas no Painel Admin</w:t>
+        <w:t>Aba 3: Sistema e Telemetria da Base RAG</w:t>
       </w:r>
     </w:p>
     <w:p>
       <w:r>
-        <w:t>Todas as notas atribuídas pelos estudantes são salvas no banco Supabase em tempo real e exibidas no Painel Admin (/admin):</w:t>
+        <w:rPr>
+          <w:b/>
+        </w:rPr>
+        <w:t xml:space="preserve">• Status da Infraestrutura: </w:t>
+      </w:r>
+      <w:r>
+        <w:t>Monitoramento em tempo real do banco de dados vetorial, da API do Google Gemini e dos servidores em nuvem.</w:t>
         <w:br/>
-        <w:t>• Card de Satisfação Geral no topo com nota média e taxa de aprovação.</w:t>
+      </w:r>
+      <w:r>
+        <w:rPr>
+          <w:b/>
+        </w:rPr>
+        <w:t xml:space="preserve">• Telemetria de Segurança: </w:t>
+      </w:r>
+      <w:r>
+        <w:t>Contador de ativação das regras de proteção e limites éticos da disciplina (Seção 5 do prompt).</w:t>
         <w:br/>
-        <w:t>• Histograma Likert detalhado de 1 a 5 estrelas com contagem e percentuais.</w:t>
-        <w:br/>
-        <w:t>• Nova coluna MÉDIA AVALIAÇÃO na Tabela de Conversas (Aba 2) e selo destacado dentro do Dossiê.</w:t>
       </w:r>
-    </w:p>
-    <w:p>
-      <w:pPr>
-        <w:pStyle w:val="Heading2"/>
-      </w:pPr>
       <w:r>
-        <w:t>1.4. Auditoria da Base RAG e Pasta Biblioteca de Livros</w:t>
+        <w:rPr>
+          <w:b/>
+        </w:rPr>
+        <w:t xml:space="preserve">• Inventário de Documentos e Livros: </w:t>
       </w:r>
-    </w:p>
-    <w:p>
       <w:r>
-        <w:t>Realizamos a auditoria completa da base de dados vetorial pgvector:</w:t>
-        <w:br/>
-        <w:t>• Total de 36.004 fragmentos de texto (chunks) e 122 documentos indexados.</w:t>
-        <w:br/>
-        <w:t>• A pasta Biblioteca (Livros Texto) representa 30.685 chunks (85,2% de todo o conhecimento do sistema).</w:t>
-        <w:br/>
-        <w:t>• O RAG sempre consulta 100% da base vetorial simultaneamente via similaridade de cosseno, sem exclusão ou restrição de pastas.</w:t>
-        <w:br/>
-        <w:t>• Criado o Módulo de Inventário RAG na Aba 3 do painel admin para acompanhamento.</w:t>
+        <w:t>Tabela completa com todos os 122 materiais indexados, detalhando o volume de fragmentos e o status ativo de cada livro da pasta Biblioteca.</w:t>
       </w:r>
     </w:p>
     <w:p>
       <w:pPr>
         <w:pStyle w:val="Heading1"/>
+        <w:spacing w:before="280" w:after="120"/>
       </w:pPr>
       <w:r>
-        <w:t>2. Guia Completo das Funcionalidades do Painel Admin (/admin)</w:t>
+        <w:t>3. Novo Recurso: Exportação Completa para Excel (.XLSX)</w:t>
       </w:r>
     </w:p>
     <w:p>
       <w:r>
-        <w:t>O Painel Administrativo oferece controle pedagógico e telemetria completa através de 3 abas principais:</w:t>
-      </w:r>
-    </w:p>
-    <w:p>
-      <w:pPr>
-        <w:pStyle w:val="Heading2"/>
-      </w:pPr>
-      <w:r>
-        <w:t>2.1. Controles Superiores e Exportação</w:t>
+        <w:t>O botão "Exportar Excel" localizado no canto superior direito do painel foi atualizado para gerar uma planilha estruturada com duas abas prontas para relatórios e análises aprofundadas:</w:t>
       </w:r>
     </w:p>
     <w:p>
       <w:r>
-        <w:t>• Filtro Temporal: Seleção rápida entre 7 dias, 30 dias ou 90 dias de histórico.</w:t>
+        <w:rPr>
+          <w:b/>
+        </w:rPr>
+        <w:t xml:space="preserve">1. Aba "Indicadores &amp; Métricas": </w:t>
+      </w:r>
+      <w:r>
+        <w:t>Consolida todos os dados quantitativos em tabelas executivas (Totais de sessões e mensagens, nota média, taxa de aprovação, distribuição percentual por modo pedagógico, ranking de temas clínicos e inventário da base de livros).</w:t>
         <w:br/>
-        <w:t>• Botão Atualizar (🔄): Sincroniza métricas instantaneamente com o banco de dados.</w:t>
-        <w:br/>
-        <w:t>• Botão Exportar Excel (📥): Gera e baixa arquivo .CSV formatado com cabeçalhos profissionais contendo todas as conversas, interações e notas.</w:t>
-      </w:r>
-    </w:p>
-    <w:p>
-      <w:pPr>
-        <w:pStyle w:val="Heading2"/>
-      </w:pPr>
-      <w:r>
-        <w:t>2.2. Aba 1: Dashboard Geral (Visão Analítica e Pedagógica)</w:t>
       </w:r>
     </w:p>
     <w:p>
       <w:r>
-        <w:t>• 5 Cards de KPIs: Total de Sessões, Total de Mensagens, Tempo Médio de Resposta (1.4s), Precisão RAG (96%) e Média de Satisfação dos Alunos (com sparklines interativos).</w:t>
-        <w:br/>
-        <w:t>• Gráfico de Volume Diário: Curva temporal de evolução do uso pelos estudantes.</w:t>
-        <w:br/>
-        <w:t>• Gráfico de Modos de Estudo: Distribuição percentual entre Resumos, Quizes, Informações e Dúvidas Livres.</w:t>
-        <w:br/>
-        <w:t>• Ranking de Temas Mais Estudados: Mostra quais temas clínicos têm maior demanda (Hemostasia, Feridas, Cirurgia Bariátrica, Anestesia, Estomas, etc.).</w:t>
-        <w:br/>
-        <w:t>• Pico de Uso por Horário: Revela em quais horários do dia os alunos mais interagem.</w:t>
-        <w:br/>
-        <w:t>• Histograma Likert: Quadro detalhado com contagem e barras de 1 a 5 estrelas.</w:t>
-        <w:br/>
-        <w:t>• Gauge Ring de Precisão: Medidor circular de fidelidade à base bibliográfica.</w:t>
+        <w:rPr>
+          <w:b/>
+        </w:rPr>
+        <w:t xml:space="preserve">2. Aba "Registro de Conversas": </w:t>
       </w:r>
-    </w:p>
-    <w:p>
-      <w:pPr>
-        <w:pStyle w:val="Heading2"/>
-      </w:pPr>
       <w:r>
-        <w:t>2.3. Aba 2: Registro de Conversas (Auditoria e Dossiês)</w:t>
-      </w:r>
-    </w:p>
-    <w:p>
-      <w:r>
-        <w:t>• Barra de Busca: Pesquisa por ID da sessão, primeira pergunta ou tema clínico.</w:t>
-        <w:br/>
-        <w:t>• Filtros por Modo Pedagógico.</w:t>
-        <w:br/>
-        <w:t>• Tabela com Numeração, Sessão, Primeira Mensagem, Tema, Horário, Interações, Média Avaliação ⭐ e Botão Ver Dossiê.</w:t>
-        <w:br/>
-        <w:t>• Modal do Dossiê Completo: Exibe todas as mensagens trocadas e oferece o botão Baixar Dossiê (.TXT) para download do arquivo completo da conversa.</w:t>
-      </w:r>
-    </w:p>
-    <w:p>
-      <w:pPr>
-        <w:pStyle w:val="Heading2"/>
-      </w:pPr>
-      <w:r>
-        <w:t>2.4. Aba 3: Sistema &amp; Telemetria</w:t>
-      </w:r>
-    </w:p>
-    <w:p>
-      <w:r>
-        <w:t>• Status dos Componentes: Monitoramento do Supabase pgvector, Google Gemini API e Vercel Serverless.</w:t>
-        <w:br/>
-        <w:t>• Telemetria de Segurança: Contagem de acionamentos dos Guard Rails da Seção 5.</w:t>
-        <w:br/>
-        <w:t>• Inventário da Base RAG: Tabela detalhada listando os 122 materiais e livros indexados, seus respectivos volumes de chunks e status ativo.</w:t>
+        <w:t>Contém a relação completa de todas as conversas com data/hora de início, última atividade, número de interações, tema detectado, nota de avaliação recebida e o texto da pergunta inicial do estudante.</w:t>
       </w:r>
     </w:p>
     <w:sectPr>
-      <w:pgSz w:w="12240" w:h="15840"/>
-      <w:pgMar w:top="1152" w:right="1152" w:bottom="1152" w:left="1152" w:header="720" w:footer="720" w:gutter="0"/>
+      <w:pgSz w:w="11909" w:h="16834"/>
+      <w:pgMar w:top="1296" w:right="1296" w:bottom="1296" w:left="1296" w:header="720" w:footer="720" w:gutter="0"/>
       <w:cols w:space="720"/>
       <w:docGrid w:linePitch="360"/>
     </w:sectPr>
@@ -648,7 +819,7 @@
       <w:rFonts w:asciiTheme="majorHAnsi" w:eastAsiaTheme="majorEastAsia" w:hAnsiTheme="majorHAnsi" w:cstheme="majorBidi"/>
       <w:b/>
       <w:bCs/>
-      <w:color w:val="0B203C"/>
+      <w:color w:val="365F91" w:themeColor="accent1" w:themeShade="BF"/>
       <w:sz w:val="28"/>
       <w:szCs w:val="28"/>
     </w:rPr>

</xml_diff>